<commit_message>
Tie learning path to Unity cafe game
</commit_message>
<xml_diff>
--- a/downloads/koulun-kahvilapeli-tyopaketti.docx
+++ b/downloads/koulun-kahvilapeli-tyopaketti.docx
@@ -164,36 +164,12 @@
             <w:shd w:fill="FFF8E8" w:val="clear"/>
           </w:tcPr>
           <w:p>
-            <w:pPr>
-              <w:spacing w:after="60"/>
-              <w:jc w:val="center"/>
-            </w:pPr>
-            <w:r/>
             <w:r>
-              <w:rPr>
-                <w:rFonts w:ascii="Calibri" w:hAnsi="Calibri" w:eastAsia="Calibri"/>
-                <w:b/>
-                <w:color w:val="D69E2E"/>
-                <w:sz w:val="17"/>
-              </w:rPr>
               <w:t>JULKAISU</w:t>
-            </w:r>
-          </w:p>
-          <w:p>
-            <w:pPr>
-              <w:spacing w:after="0"/>
-              <w:jc w:val="center"/>
-            </w:pPr>
-            <w:r>
-              <w:rPr>
-                <w:rFonts w:ascii="Calibri" w:hAnsi="Calibri" w:eastAsia="Calibri"/>
-                <w:b/>
-                <w:color w:val="0B2545"/>
-                <w:sz w:val="19"/>
-              </w:rPr>
+              <w:br/>
               <w:t>vko 48</w:t>
               <w:br/>
-              <w:t>v1.0 verkkoon</w:t>
+              <w:t>Unity WebGL / GitHub Pages</w:t>
             </w:r>
           </w:p>
         </w:tc>
@@ -462,13 +438,22 @@
         <w:spacing w:before="0" w:after="120" w:line="300" w:lineRule="auto"/>
       </w:pPr>
       <w:r>
+        <w:t>Toteuta Unity 2D + C# -projektina selaimessa toimiva koulun kahvilapeli. Asiakkaita saapuu tiskille ja he tilaavat 1-3 tuotetta. Pelaajan tehtävä on toimittaa oikea tilaus mahdollisimman nopeasti.</w:t>
+      </w:r>
+    </w:p>
+    <w:p>
+      <w:pPr>
+        <w:spacing w:before="80" w:after="160"/>
+        <w:shd w:fill="EAF1FF"/>
+      </w:pPr>
+      <w:r>
         <w:rPr>
-          <w:rFonts w:ascii="Calibri" w:hAnsi="Calibri" w:eastAsia="Calibri"/>
-          <w:i w:val="0"/>
-          <w:color w:val="000000"/>
-          <w:sz w:val="21"/>
+          <w:b/>
         </w:rPr>
-        <w:t>Tee PC:llä tai selaimessa toimiva peli, jossa pelaaja työskentelee koulun kahvilassa. Asiakkaita saapuu tiskille ja he tilaavat 1-3 tuotetta. Pelaajan tehtävä on toimittaa oikea tilaus mahdollisimman nopeasti.</w:t>
+        <w:t xml:space="preserve">Sovittu toteutustapa: </w:t>
+      </w:r>
+      <w:r>
+        <w:t>Unity 2D + C#, yksi CafeGame-scene, Canvas-paneelit, products.json TextAssetina, top 5 PlayerPrefsissa ja WebGL-julkaisu GitHub Pagesiin. Käytä samaa oppilaitoksen määrittämää Unity-versiota koko projektin ajan.</w:t>
       </w:r>
     </w:p>
     <w:p>
@@ -496,21 +481,7 @@
         </w:pBdr>
       </w:pPr>
       <w:r>
-        <w:rPr>
-          <w:rFonts w:ascii="Calibri" w:hAnsi="Calibri" w:eastAsia="Calibri"/>
-          <w:b/>
-          <w:color w:val="0B2545"/>
-          <w:sz w:val="21"/>
-        </w:rPr>
-        <w:t xml:space="preserve">Tärkeä rajaus: </w:t>
-      </w:r>
-      <w:r>
-        <w:rPr>
-          <w:rFonts w:ascii="Calibri" w:hAnsi="Calibri" w:eastAsia="Calibri"/>
-          <w:color w:val="0B2545"/>
-          <w:sz w:val="21"/>
-        </w:rPr>
-        <w:t>älä lisää ominaisuutta vain siksi, että se kuulostaa hienolta. Pakollinen, toimiva kokonaisuus tehdään ensin. Vasta sen jälkeen voidaan lisätä esimerkiksi pause, vaikeustasot tai ääniä. Verkkopeli, käyttäjätilit, oikeat maksut ja laaja 3D-maailma eivät kuulu projektiin.</w:t>
+        <w:t>Tärkeä rajaus: älä lisää ominaisuutta vain siksi, että se kuulostaa hienolta. Pakollinen, toimiva kokonaisuus tehdään ensin. Vasta sen jälkeen voidaan lisätä esimerkiksi pause, vaikeustasot tai ääniä. Verkkomoninpeli, käyttäjätilit, oikeat maksut ja laaja 3D-maailma eivät kuulu projektiin.</w:t>
       </w:r>
     </w:p>
     <w:p>
@@ -531,12 +502,7 @@
         <w:spacing w:after="80" w:line="276" w:lineRule="auto"/>
       </w:pPr>
       <w:r>
-        <w:rPr>
-          <w:rFonts w:ascii="Calibri" w:hAnsi="Calibri" w:eastAsia="Calibri"/>
-          <w:color w:val="000000"/>
-          <w:sz w:val="20"/>
-        </w:rPr>
-        <w:t>Mille alustalle peli julkaistaan ja millä tavalla sitä ohjataan?</w:t>
+        <w:t>Millä selaimilla ja laitteilla Unity WebGL -versio testataan, ja millä tavalla peliä ohjataan?</w:t>
       </w:r>
     </w:p>
     <w:p>
@@ -616,12 +582,7 @@
         <w:spacing w:after="80" w:line="276" w:lineRule="auto"/>
       </w:pPr>
       <w:r>
-        <w:rPr>
-          <w:rFonts w:ascii="Calibri" w:hAnsi="Calibri" w:eastAsia="Calibri"/>
-          <w:color w:val="000000"/>
-          <w:sz w:val="20"/>
-        </w:rPr>
-        <w:t>Mitä tuloksesta tallennetaan: pistemäärä, nimimerkki, päivämäärä vai vain paras tulos?</w:t>
+        <w:t>Millä nimimerkkisäännöillä ja tasatilanteen järjestyksellä viiden parhaan tuloksen lista toteutetaan?</w:t>
       </w:r>
     </w:p>
     <w:p>
@@ -761,12 +722,7 @@
         <w:spacing w:after="80" w:line="276" w:lineRule="auto"/>
       </w:pPr>
       <w:r>
-        <w:rPr>
-          <w:rFonts w:ascii="Calibri" w:hAnsi="Calibri" w:eastAsia="Calibri"/>
-          <w:color w:val="000000"/>
-          <w:sz w:val="20"/>
-        </w:rPr>
-        <w:t>Paras tulos tai tuloslista tallentuu ja latautuu uudelleen pelin käynnistyessä.</w:t>
+        <w:t>Viiden parhaan tuloksen lista tallentuu ja latautuu uudelleen pelin käynnistyessä.</w:t>
       </w:r>
     </w:p>
     <w:p>
@@ -961,21 +917,7 @@
         <w:spacing w:before="60" w:after="30" w:line="276" w:lineRule="auto"/>
       </w:pPr>
       <w:r>
-        <w:rPr>
-          <w:rFonts w:ascii="Calibri" w:hAnsi="Calibri" w:eastAsia="Calibri"/>
-          <w:b/>
-          <w:color w:val="1F4D78"/>
-          <w:sz w:val="21"/>
-        </w:rPr>
-        <w:t>Valitse sovittu kehitysympäristö.</w:t>
-      </w:r>
-      <w:r>
-        <w:rPr>
-          <w:rFonts w:ascii="Calibri" w:hAnsi="Calibri" w:eastAsia="Calibri"/>
-          <w:color w:val="000000"/>
-          <w:sz w:val="20"/>
-        </w:rPr>
-        <w:t xml:space="preserve"> Käytä koulussa sovittua pelimoottoria ja ohjelmointikieltä. Varmista, että tyhjä testiprojekti käynnistyy ja siitä voidaan tehdä julkaisupaketti.</w:t>
+        <w:t>Käytä oppilaitoksen määrittämää Unity-versiota Unity Hubissa. Luo 2D-projekti ja CafeGame-scene. Varmista heti, että tyhjästä projektista voidaan tehdä toimiva WebGL-testibuild.</w:t>
       </w:r>
     </w:p>
     <w:p>
@@ -2090,13 +2032,7 @@
         <w:spacing w:before="0" w:after="120" w:line="300" w:lineRule="auto"/>
       </w:pPr>
       <w:r>
-        <w:rPr>
-          <w:rFonts w:ascii="Calibri" w:hAnsi="Calibri" w:eastAsia="Calibri"/>
-          <w:i w:val="0"/>
-          <w:color w:val="5B6573"/>
-          <w:sz w:val="19"/>
-        </w:rPr>
-        <w:t>Täytä yksi rivi aina, kun tekoäly vaikutti projektiin jäävään koodiin, suunnitelmaan, testiin tai dokumentointiin.</w:t>
+        <w:t>Täytä yksi rivi aina, kun tekoäly vaikutti projektiin jäävään työhön. Lisää todisteviite ja varmista, ettet syöttänyt henkilötietoja, salaisuuksia tai luottamuksellista aineistoa.</w:t>
       </w:r>
     </w:p>
     <w:tbl>
@@ -2196,19 +2132,13 @@
             <w:shd w:fill="1F4D78" w:val="clear"/>
           </w:tcPr>
           <w:p>
-            <w:pPr>
-              <w:spacing w:before="0" w:after="30" w:line="259" w:lineRule="auto"/>
-              <w:jc w:val="center"/>
-            </w:pPr>
-            <w:r/>
             <w:r>
               <w:rPr>
-                <w:rFonts w:ascii="Calibri" w:hAnsi="Calibri" w:eastAsia="Calibri"/>
                 <w:b/>
                 <w:color w:val="FFFFFF"/>
-                <w:sz w:val="17"/>
+                <w:sz w:val="18"/>
               </w:rPr>
-              <w:t>Mitä käytin tai muutin?</w:t>
+              <w:t>Mitä käytin, muutin tai hylkäsin?</w:t>
             </w:r>
           </w:p>
         </w:tc>
@@ -2225,19 +2155,13 @@
             <w:shd w:fill="1F4D78" w:val="clear"/>
           </w:tcPr>
           <w:p>
-            <w:pPr>
-              <w:spacing w:before="0" w:after="30" w:line="259" w:lineRule="auto"/>
-              <w:jc w:val="center"/>
-            </w:pPr>
-            <w:r/>
             <w:r>
               <w:rPr>
-                <w:rFonts w:ascii="Calibri" w:hAnsi="Calibri" w:eastAsia="Calibri"/>
                 <w:b/>
                 <w:color w:val="FFFFFF"/>
-                <w:sz w:val="17"/>
+                <w:sz w:val="18"/>
               </w:rPr>
-              <w:t>Miten tarkistin ja mitä opin?</w:t>
+              <w:t>Miten tarkistin ja mitä opin? Todisteviite</w:t>
             </w:r>
           </w:p>
         </w:tc>
@@ -3799,11 +3723,7 @@
               <w:spacing w:after="40" w:line="252" w:lineRule="auto"/>
             </w:pPr>
             <w:r>
-              <w:rPr>
-                <w:rFonts w:ascii="Calibri" w:hAnsi="Calibri" w:eastAsia="Calibri"/>
-                <w:sz w:val="18"/>
-              </w:rPr>
-              <w:t>Valitse sovittu kehitysympäristö, tee testiprojekti ja varmista build.</w:t>
+              <w:t>Asenna sovittu Unity-versio Unity Hubissa, luo 2D-projekti ja varmista WebGL-testibuild.</w:t>
             </w:r>
           </w:p>
           <w:p>
@@ -3993,13 +3913,8 @@
               </w:numPr>
               <w:spacing w:after="40" w:line="252" w:lineRule="auto"/>
             </w:pPr>
-            <w:r/>
             <w:r>
-              <w:rPr>
-                <w:rFonts w:ascii="Calibri" w:hAnsi="Calibri" w:eastAsia="Calibri"/>
-                <w:sz w:val="18"/>
-              </w:rPr>
-              <w:t>Täytä dokumentointipohjan osat 1-3 ensimmäiseen versioon.</w:t>
+              <w:t>Täytä dokumentointipohjan osat 1-4 ensimmäiseen versioon.</w:t>
             </w:r>
           </w:p>
           <w:p>
@@ -4027,11 +3942,7 @@
               <w:spacing w:after="40" w:line="252" w:lineRule="auto"/>
             </w:pPr>
             <w:r>
-              <w:rPr>
-                <w:rFonts w:ascii="Calibri" w:hAnsi="Calibri" w:eastAsia="Calibri"/>
-                <w:sz w:val="18"/>
-              </w:rPr>
-              <w:t>Piirrä UI-mockup ja suunnittele koodin osat, tilat, JSON sekä tallennus.</w:t>
+              <w:t>Piirrä UI-mockup ja suunnittele Unityn CafeGame-scene, Canvas-paneelit, C#-vastuut, JSON sekä tallennus.</w:t>
             </w:r>
           </w:p>
         </w:tc>
@@ -4205,13 +4116,8 @@
               </w:numPr>
               <w:spacing w:after="40" w:line="252" w:lineRule="auto"/>
             </w:pPr>
-            <w:r/>
             <w:r>
-              <w:rPr>
-                <w:rFonts w:ascii="Calibri" w:hAnsi="Calibri" w:eastAsia="Calibri"/>
-                <w:sz w:val="18"/>
-              </w:rPr>
-              <w:t>Tee aloitusvalikko, pelinäkymä ja lopetusnäkymä väliaikaisella grafiikalla.</w:t>
+              <w:t>Tee CafeGame-scenen Canvasille MenuPanel, GamePanel ja ResultPanel väliaikaisella grafiikalla.</w:t>
             </w:r>
           </w:p>
           <w:p>
@@ -4417,13 +4323,8 @@
               </w:numPr>
               <w:spacing w:after="40" w:line="252" w:lineRule="auto"/>
             </w:pPr>
-            <w:r/>
             <w:r>
-              <w:rPr>
-                <w:rFonts w:ascii="Calibri" w:hAnsi="Calibri" w:eastAsia="Calibri"/>
-                <w:sz w:val="18"/>
-              </w:rPr>
-              <w:t>Luo JSON-tuotedata ja toteuta lataus sekä virheenkäsittely.</w:t>
+              <w:t>Luo products.json ja lataa se Unityn TextAsset-viitteenä C#-olioiksi JsonUtilitylla; käsittele puuttuva ja rikkinäinen data.</w:t>
             </w:r>
           </w:p>
           <w:p>
@@ -4451,11 +4352,7 @@
               <w:spacing w:after="40" w:line="252" w:lineRule="auto"/>
             </w:pPr>
             <w:r>
-              <w:rPr>
-                <w:rFonts w:ascii="Calibri" w:hAnsi="Calibri" w:eastAsia="Calibri"/>
-                <w:sz w:val="18"/>
-              </w:rPr>
-              <w:t>Pidä koodi erillään käyttöliittymästä ja dokumentoi vastuut.</w:t>
+              <w:t>Pidä OrderManagerin C#-logiikka erillään UIControllerista ja dokumentoi vastuut.</w:t>
             </w:r>
           </w:p>
         </w:tc>
@@ -4643,13 +4540,8 @@
               </w:numPr>
               <w:spacing w:after="40" w:line="252" w:lineRule="auto"/>
             </w:pPr>
-            <w:r/>
             <w:r>
-              <w:rPr>
-                <w:rFonts w:ascii="Calibri" w:hAnsi="Calibri" w:eastAsia="Calibri"/>
-                <w:sz w:val="18"/>
-              </w:rPr>
-              <w:t>Toteuta pisteytys, ajastin ja pelin päättymisehdot.</w:t>
+              <w:t>Toteuta C#:lla pisteytys, Time.deltaTime-ajastin ja pelin päättymisehdot.</w:t>
             </w:r>
           </w:p>
           <w:p>
@@ -4661,11 +4553,7 @@
               <w:spacing w:after="40" w:line="252" w:lineRule="auto"/>
             </w:pPr>
             <w:r>
-              <w:rPr>
-                <w:rFonts w:ascii="Calibri" w:hAnsi="Calibri" w:eastAsia="Calibri"/>
-                <w:sz w:val="18"/>
-              </w:rPr>
-              <w:t>Näytä pelaajalle tilaus, aika, pisteet sekä onnistumisen/virheen palaute.</w:t>
+              <w:t>Näytä Unityn TextMeshPro-kentissä tilaus, aika, pisteet sekä onnistumisen tai virheen palaute.</w:t>
             </w:r>
           </w:p>
           <w:p>
@@ -5067,13 +4955,8 @@
               </w:numPr>
               <w:spacing w:after="40" w:line="252" w:lineRule="auto"/>
             </w:pPr>
-            <w:r/>
             <w:r>
-              <w:rPr>
-                <w:rFonts w:ascii="Calibri" w:hAnsi="Calibri" w:eastAsia="Calibri"/>
-                <w:sz w:val="18"/>
-              </w:rPr>
-              <w:t>Tallenna ja lataa sovittu paras tulos tai tuloslista.</w:t>
+              <w:t>Tallenna ja lataa Unityn PlayerPrefsilla viiden parhaan tuloksen ScoreList JSON-merkkijonona.</w:t>
             </w:r>
           </w:p>
           <w:p>
@@ -5085,11 +4968,7 @@
               <w:spacing w:after="40" w:line="252" w:lineRule="auto"/>
             </w:pPr>
             <w:r>
-              <w:rPr>
-                <w:rFonts w:ascii="Calibri" w:hAnsi="Calibri" w:eastAsia="Calibri"/>
-                <w:sz w:val="18"/>
-              </w:rPr>
-              <w:t>Perustele tiedostomuoto ja tallennuspaikka dokumentointipohjan osassa 4.</w:t>
+              <w:t>Perustele dokumentointipohjan osassa 4, miksi top 5 tallennetaan JSON-merkkijonona PlayerPrefsiin ja mitkä ovat ratkaisun rajat.</w:t>
             </w:r>
           </w:p>
           <w:p>
@@ -5983,11 +5862,7 @@
               <w:spacing w:after="40" w:line="252" w:lineRule="auto"/>
             </w:pPr>
             <w:r>
-              <w:rPr>
-                <w:rFonts w:ascii="Calibri" w:hAnsi="Calibri" w:eastAsia="Calibri"/>
-                <w:sz w:val="18"/>
-              </w:rPr>
-              <w:t>Kirjaa vähintään 3 oikeaa bugia: odotettu, havaittu, syy, korjaus ja uusintatesti.</w:t>
+              <w:t>Kirjaa kaikki aidot havainnot. Osoita 3 täydellistä virheenkorjausketjua aidoista havainnoista tai opettajan merkitsemistä vikatehtävistä.</w:t>
             </w:r>
           </w:p>
           <w:p>
@@ -6633,11 +6508,7 @@
               <w:spacing w:after="40" w:line="252" w:lineRule="auto"/>
             </w:pPr>
             <w:r>
-              <w:rPr>
-                <w:rFonts w:ascii="Calibri" w:hAnsi="Calibri" w:eastAsia="Calibri"/>
-                <w:sz w:val="18"/>
-              </w:rPr>
-              <w:t>Tee puhdas build, versionumero/tagi ja julkaise sovittuun ympäristöön.</w:t>
+              <w:t>Tee puhdas Unity WebGL -build docs-kansioon, lisää v1.0-tagi ja julkaise GitHub Pagesiin.</w:t>
             </w:r>
           </w:p>
           <w:p>
@@ -7627,12 +7498,7 @@
         <w:spacing w:after="80" w:line="276" w:lineRule="auto"/>
       </w:pPr>
       <w:r>
-        <w:rPr>
-          <w:rFonts w:ascii="Calibri" w:hAnsi="Calibri" w:eastAsia="Calibri"/>
-          <w:color w:val="000000"/>
-          <w:sz w:val="20"/>
-        </w:rPr>
-        <w:t>Vähintään 3 oikeaa virhettä, joista on kirjattu syy, korjaus ja onnistunut uusintatesti.</w:t>
+        <w:t>3 täydellistä virheenkorjausketjua aidoista havainnoista tai opettajan merkitsemistä vikatehtävistä.</w:t>
       </w:r>
     </w:p>
     <w:p>
@@ -7678,12 +7544,7 @@
         <w:spacing w:after="80" w:line="276" w:lineRule="auto"/>
       </w:pPr>
       <w:r>
-        <w:rPr>
-          <w:rFonts w:ascii="Calibri" w:hAnsi="Calibri" w:eastAsia="Calibri"/>
-          <w:color w:val="000000"/>
-          <w:sz w:val="20"/>
-        </w:rPr>
-        <w:t>Julkaistu versio testataan muussa kuin omassa tavallisessa kehitysympäristössä.</w:t>
+        <w:t>Julkaistu Unity WebGL -versio testataan GitHub Pages -linkistä toisella selaimella tai laitteella, ei vain Unity Editorin Play Modessa.</w:t>
       </w:r>
     </w:p>
     <w:p>
@@ -8015,15 +7876,8 @@
               <w:spacing w:before="0" w:after="30" w:line="259" w:lineRule="auto"/>
               <w:jc w:val="left"/>
             </w:pPr>
-            <w:r/>
             <w:r>
-              <w:rPr>
-                <w:rFonts w:ascii="Calibri" w:hAnsi="Calibri" w:eastAsia="Calibri"/>
-                <w:b w:val="0"/>
-                <w:color w:val="000000"/>
-                <w:sz w:val="17"/>
-              </w:rPr>
-              <w:t>Työskentele sovitussa pelimoottorissa/editorissa ja tee build itse.</w:t>
+              <w:t>Työskentele sovitussa Unity-versiossa ja tee WebGL-build itse.</w:t>
             </w:r>
           </w:p>
         </w:tc>
@@ -8131,15 +7985,8 @@
               <w:spacing w:before="0" w:after="30" w:line="259" w:lineRule="auto"/>
               <w:jc w:val="left"/>
             </w:pPr>
-            <w:r/>
             <w:r>
-              <w:rPr>
-                <w:rFonts w:ascii="Calibri" w:hAnsi="Calibri" w:eastAsia="Calibri"/>
-                <w:b w:val="0"/>
-                <w:color w:val="000000"/>
-                <w:sz w:val="17"/>
-              </w:rPr>
-              <w:t>Käytä virheilmoituksia, lokia tai debuggeria ja selitä vähintään 3 bugin syy.</w:t>
+              <w:t>Käytä Unity Consolea tai debuggeria ja selitä 3 täydellistä korjausketjua aidoista havainnoista tai merkityistä vikatehtävistä.</w:t>
             </w:r>
           </w:p>
         </w:tc>
@@ -9453,15 +9300,8 @@
               <w:spacing w:before="0" w:after="30" w:line="259" w:lineRule="auto"/>
               <w:jc w:val="left"/>
             </w:pPr>
-            <w:r/>
             <w:r>
-              <w:rPr>
-                <w:rFonts w:ascii="Calibri" w:hAnsi="Calibri" w:eastAsia="Calibri"/>
-                <w:b w:val="0"/>
-                <w:color w:val="000000"/>
-                <w:sz w:val="16"/>
-              </w:rPr>
-              <w:t>Kysy avoimet vaatimukset ja varmista kohderyhmä, alusta sekä tavoite.</w:t>
+              <w:t>Kysy avoimet vaatimukset ja varmista kohderyhmä, WebGL-testiselaimet sekä tavoite.</w:t>
             </w:r>
           </w:p>
         </w:tc>
@@ -10268,15 +10108,8 @@
               <w:spacing w:before="0" w:after="30" w:line="259" w:lineRule="auto"/>
               <w:jc w:val="left"/>
             </w:pPr>
-            <w:r/>
             <w:r>
-              <w:rPr>
-                <w:rFonts w:ascii="Calibri" w:hAnsi="Calibri" w:eastAsia="Calibri"/>
-                <w:b w:val="0"/>
-                <w:color w:val="000000"/>
-                <w:sz w:val="16"/>
-              </w:rPr>
-              <w:t>Valitse JSON-/paikallinen tallennusratkaisu ja perustele sopivuus.</w:t>
+              <w:t>Käytä tuotteisiin TextAsset + JSON -ratkaisua ja top 5 -listaan PlayerPrefsiin tallennettua JSON-merkkijonoa; perustele sopivuus.</w:t>
             </w:r>
           </w:p>
         </w:tc>
@@ -10385,15 +10218,8 @@
               <w:spacing w:before="0" w:after="30" w:line="259" w:lineRule="auto"/>
               <w:jc w:val="left"/>
             </w:pPr>
-            <w:r/>
             <w:r>
-              <w:rPr>
-                <w:rFonts w:ascii="Calibri" w:hAnsi="Calibri" w:eastAsia="Calibri"/>
-                <w:b w:val="0"/>
-                <w:color w:val="000000"/>
-                <w:sz w:val="16"/>
-              </w:rPr>
-              <w:t>Lue tuotedata ja tallenna/lataa sovittu tulos.</w:t>
+              <w:t>Lue products.json JsonUtilitylla ja tallenna/lataa top 5 PlayerPrefsista.</w:t>
             </w:r>
           </w:p>
         </w:tc>
@@ -10501,15 +10327,8 @@
               <w:spacing w:before="0" w:after="30" w:line="259" w:lineRule="auto"/>
               <w:jc w:val="left"/>
             </w:pPr>
-            <w:r/>
             <w:r>
-              <w:rPr>
-                <w:rFonts w:ascii="Calibri" w:hAnsi="Calibri" w:eastAsia="Calibri"/>
-                <w:b w:val="0"/>
-                <w:color w:val="000000"/>
-                <w:sz w:val="16"/>
-              </w:rPr>
-              <w:t>Käytä pelimoottorin ja JSON-käsittelyn rajapintoja; muuta data pelin olioiksi.</w:t>
+              <w:t>Käytä Unityn TextAsset-, JsonUtility- ja PlayerPrefs-rajapintoja; muuta data C#-olioiksi.</w:t>
             </w:r>
           </w:p>
         </w:tc>
@@ -10967,15 +10786,8 @@
               <w:spacing w:before="0" w:after="30" w:line="259" w:lineRule="auto"/>
               <w:jc w:val="left"/>
             </w:pPr>
-            <w:r/>
             <w:r>
-              <w:rPr>
-                <w:rFonts w:ascii="Calibri" w:hAnsi="Calibri" w:eastAsia="Calibri"/>
-                <w:b w:val="0"/>
-                <w:color w:val="000000"/>
-                <w:sz w:val="16"/>
-              </w:rPr>
-              <w:t>Tee v1.0 ja julkaise itch.io:on, koulun palvelimelle tai sovittuun ympäristöön.</w:t>
+              <w:t>Tee Unity WebGL v1.0 ja julkaise se GitHub Pagesiin repositoryn docs-kansiosta.</w:t>
             </w:r>
           </w:p>
         </w:tc>
@@ -11505,15 +11317,8 @@
               <w:spacing w:before="0" w:after="30" w:line="259" w:lineRule="auto"/>
               <w:jc w:val="left"/>
             </w:pPr>
-            <w:r/>
             <w:r>
-              <w:rPr>
-                <w:rFonts w:ascii="Calibri" w:hAnsi="Calibri" w:eastAsia="Calibri"/>
-                <w:b w:val="0"/>
-                <w:color w:val="000000"/>
-                <w:sz w:val="17"/>
-              </w:rPr>
-              <w:t>Osien vastuut, pelitilat, mockup, JSON/tallennus, rajapinnat ja tietoturva.</w:t>
+              <w:t>CafeGame-scene, Canvas-paneelit, C#-vastuut, mockup, TextAsset + JSON, PlayerPrefs, rajapinnat ja tietoturva.</w:t>
             </w:r>
           </w:p>
         </w:tc>
@@ -12448,7 +12253,7 @@
           <w:ilvl w:val="0"/>
           <w:numId w:val="15"/>
         </w:numPr>
-        <w:spacing w:after="80" w:line="276" w:lineRule="auto"/>
+        <w:spacing w:after="0" w:line="276" w:lineRule="auto"/>
       </w:pPr>
       <w:r>
         <w:rPr>
@@ -12465,7 +12270,7 @@
           <w:ilvl w:val="0"/>
           <w:numId w:val="15"/>
         </w:numPr>
-        <w:spacing w:after="80" w:line="276" w:lineRule="auto"/>
+        <w:spacing w:after="0" w:line="276" w:lineRule="auto"/>
       </w:pPr>
       <w:r>
         <w:rPr>
@@ -12482,7 +12287,7 @@
           <w:ilvl w:val="0"/>
           <w:numId w:val="15"/>
         </w:numPr>
-        <w:spacing w:after="80" w:line="276" w:lineRule="auto"/>
+        <w:spacing w:after="0" w:line="276" w:lineRule="auto"/>
       </w:pPr>
       <w:r>
         <w:rPr>
@@ -12499,7 +12304,7 @@
           <w:ilvl w:val="0"/>
           <w:numId w:val="15"/>
         </w:numPr>
-        <w:spacing w:after="80" w:line="276" w:lineRule="auto"/>
+        <w:spacing w:after="0" w:line="276" w:lineRule="auto"/>
       </w:pPr>
       <w:r>
         <w:rPr>
@@ -12516,7 +12321,7 @@
           <w:ilvl w:val="0"/>
           <w:numId w:val="15"/>
         </w:numPr>
-        <w:spacing w:after="80" w:line="276" w:lineRule="auto"/>
+        <w:spacing w:after="0" w:line="276" w:lineRule="auto"/>
       </w:pPr>
       <w:r>
         <w:rPr>
@@ -12533,7 +12338,7 @@
           <w:ilvl w:val="0"/>
           <w:numId w:val="15"/>
         </w:numPr>
-        <w:spacing w:after="80" w:line="276" w:lineRule="auto"/>
+        <w:spacing w:after="0" w:line="276" w:lineRule="auto"/>
       </w:pPr>
       <w:r>
         <w:rPr>
@@ -12550,7 +12355,7 @@
           <w:ilvl w:val="0"/>
           <w:numId w:val="15"/>
         </w:numPr>
-        <w:spacing w:after="80" w:line="276" w:lineRule="auto"/>
+        <w:spacing w:after="0" w:line="276" w:lineRule="auto"/>
       </w:pPr>
       <w:r>
         <w:rPr>
@@ -12567,7 +12372,7 @@
           <w:ilvl w:val="0"/>
           <w:numId w:val="15"/>
         </w:numPr>
-        <w:spacing w:after="80" w:line="276" w:lineRule="auto"/>
+        <w:spacing w:after="0" w:line="276" w:lineRule="auto"/>
       </w:pPr>
       <w:r>
         <w:rPr>

</xml_diff>

<commit_message>
Add interactive project diary and clearer guidance
</commit_message>
<xml_diff>
--- a/downloads/koulun-kahvilapeli-tyopaketti.docx
+++ b/downloads/koulun-kahvilapeli-tyopaketti.docx
@@ -316,7 +316,7 @@
           <w:color w:val="000000"/>
           <w:sz w:val="21"/>
         </w:rPr>
-        <w:t>Lue ensin toimeksianto ja kirjoita asiakkaalle kysymykset. Älä päätä avoimia vaatimuksia yksin.</w:t>
+        <w:t>Lue ajantasaiset ohjeet KahvilaKoodi-sivustolta. Älä päätä avoimia asiakasvaatimuksia yksin.</w:t>
       </w:r>
     </w:p>
     <w:p>
@@ -333,7 +333,7 @@
           <w:color w:val="000000"/>
           <w:sz w:val="21"/>
         </w:rPr>
-        <w:t>Merkitse viikkoaikatauluun valmistuneet asiat ja näytön todisteet joka perjantai.</w:t>
+        <w:t>Täytä sivuston viikkokohtainen projektipäiväkirja joka perjantai: mitä teit ja miten, miksi sekä missä todiste on.</w:t>
       </w:r>
     </w:p>
     <w:p>
@@ -345,21 +345,7 @@
         <w:spacing w:after="80" w:line="276" w:lineRule="auto"/>
       </w:pPr>
       <w:r>
-        <w:rPr>
-          <w:rFonts w:ascii="Calibri" w:hAnsi="Calibri" w:eastAsia="Calibri"/>
-          <w:b/>
-          <w:color w:val="000000"/>
-          <w:sz w:val="21"/>
-        </w:rPr>
-        <w:t>Täytä erillistä Näytön dokumentointipohjat -työpakettia työn aikana</w:t>
-      </w:r>
-      <w:r>
-        <w:rPr>
-          <w:rFonts w:ascii="Calibri" w:hAnsi="Calibri" w:eastAsia="Calibri"/>
-          <w:color w:val="000000"/>
-          <w:sz w:val="21"/>
-        </w:rPr>
-        <w:t>, ei vasta lopussa.</w:t>
+        <w:t>Lataa koko projektipäiväkirja sivustolta ja korvaa repositoryn tiedosto project-docs/projektipaivakirja.md. Tee sen jälkeen commit ja push.</w:t>
       </w:r>
     </w:p>
     <w:p>
@@ -376,7 +362,7 @@
           <w:color w:val="000000"/>
           <w:sz w:val="21"/>
         </w:rPr>
-        <w:t>Kokoa lopuksi näyttöaineisto: julkaistu peli, repository, katselmoinnit, testit, dokumentit ja itsearviointi.</w:t>
+        <w:t>Tämä paperinen paketti on aikataulu ja tarkistuslista. Älä kirjoita samoja vastauksia tähän ja sivustolle. Täytä alkuperäinen Word-pohja erikseen vain, jos opettaja antaa siitä erillisen ohjeen.</w:t>
       </w:r>
     </w:p>
     <w:p>
@@ -481,7 +467,7 @@
         </w:pBdr>
       </w:pPr>
       <w:r>
-        <w:t>Tärkeä rajaus: älä lisää ominaisuutta vain siksi, että se kuulostaa hienolta. Pakollinen, toimiva kokonaisuus tehdään ensin. Vasta sen jälkeen voidaan lisätä esimerkiksi pause, vaikeustasot tai ääniä. Verkkomoninpeli, käyttäjätilit, oikeat maksut ja laaja 3D-maailma eivät kuulu projektiin.</w:t>
+        <w:t>Tärkeä rajaus: älä lisää ominaisuutta vain siksi, että se kuulostaa hienolta. P0 eli pakollinen, toimiva perusversio tehdään ensin. Vasta sen jälkeen voidaan lisätä esimerkiksi pause, vaikeustasot tai ääniä. Verkkomoninpeli, käyttäjätilit, oikeat maksut ja laaja 3D-maailma eivät kuulu projektiin.</w:t>
       </w:r>
     </w:p>
     <w:p>
@@ -890,21 +876,7 @@
         <w:ind w:left="540"/>
       </w:pPr>
       <w:r>
-        <w:rPr>
-          <w:rFonts w:ascii="Calibri" w:hAnsi="Calibri" w:eastAsia="Calibri"/>
-          <w:b/>
-          <w:color w:val="5B6573"/>
-          <w:sz w:val="19"/>
-        </w:rPr>
-        <w:t xml:space="preserve">Näytön todiste: </w:t>
-      </w:r>
-      <w:r>
-        <w:rPr>
-          <w:rFonts w:ascii="Calibri" w:hAnsi="Calibri" w:eastAsia="Calibri"/>
-          <w:color w:val="5B6573"/>
-          <w:sz w:val="19"/>
-        </w:rPr>
-        <w:t>Asiakastarve ja päätökset dokumentointipohjan osassa 2.</w:t>
+        <w:t>Näytön todiste: Asiakastarve ja päätökset projektipäiväkirjan Vko 34 -merkinnässä.</w:t>
       </w:r>
     </w:p>
     <w:p>
@@ -953,21 +925,7 @@
         <w:spacing w:before="60" w:after="30" w:line="276" w:lineRule="auto"/>
       </w:pPr>
       <w:r>
-        <w:rPr>
-          <w:rFonts w:ascii="Calibri" w:hAnsi="Calibri" w:eastAsia="Calibri"/>
-          <w:b/>
-          <w:color w:val="1F4D78"/>
-          <w:sz w:val="21"/>
-        </w:rPr>
-        <w:t>Perusta Git-repository ennen varsinaista koodausta.</w:t>
-      </w:r>
-      <w:r>
-        <w:rPr>
-          <w:rFonts w:ascii="Calibri" w:hAnsi="Calibri" w:eastAsia="Calibri"/>
-          <w:color w:val="000000"/>
-          <w:sz w:val="20"/>
-        </w:rPr>
-        <w:t xml:space="preserve"> Lisää oikea .gitignore, README ja docs-kansio. Tee ensimmäinen commit ja varmista, että repository näkyy etäpalvelussa.</w:t>
+        <w:t>Perusta Git-repository ennen varsinaista koodausta. Lisää oikea .gitignore, README ja project-docs-kansio. Varaa docs-kansio myöhemmin vain GitHub Pagesiin julkaistavalle WebGL-pelille. Tee ensimmäinen commit ja varmista, että repository näkyy GitHubissa.</w:t>
       </w:r>
     </w:p>
     <w:p>
@@ -1003,21 +961,7 @@
         <w:spacing w:before="60" w:after="30" w:line="276" w:lineRule="auto"/>
       </w:pPr>
       <w:r>
-        <w:rPr>
-          <w:rFonts w:ascii="Calibri" w:hAnsi="Calibri" w:eastAsia="Calibri"/>
-          <w:b/>
-          <w:color w:val="1F4D78"/>
-          <w:sz w:val="21"/>
-        </w:rPr>
-        <w:t>Täytä näyttöprojektin suunnitelman ensimmäinen versio.</w:t>
-      </w:r>
-      <w:r>
-        <w:rPr>
-          <w:rFonts w:ascii="Calibri" w:hAnsi="Calibri" w:eastAsia="Calibri"/>
-          <w:color w:val="000000"/>
-          <w:sz w:val="20"/>
-        </w:rPr>
-        <w:t xml:space="preserve"> Kirjaa tavoite, käyttäjäryhmä, teknologiat, oma rooli, tärkeimmät ominaisuudet, prioriteetit ja valmis kun -ehdot.</w:t>
+        <w:t>Täytä sivuston Vko 35 -projektipäiväkirja. Kirjaa tavoite, käyttäjä, teknologiat, oma rooli, tärkeimmät ominaisuudet, prioriteetit ja valmis kun -ehdot.</w:t>
       </w:r>
     </w:p>
     <w:p>
@@ -1026,21 +970,7 @@
         <w:ind w:left="540"/>
       </w:pPr>
       <w:r>
-        <w:rPr>
-          <w:rFonts w:ascii="Calibri" w:hAnsi="Calibri" w:eastAsia="Calibri"/>
-          <w:b/>
-          <w:color w:val="5B6573"/>
-          <w:sz w:val="19"/>
-        </w:rPr>
-        <w:t xml:space="preserve">Näytön todiste: </w:t>
-      </w:r>
-      <w:r>
-        <w:rPr>
-          <w:rFonts w:ascii="Calibri" w:hAnsi="Calibri" w:eastAsia="Calibri"/>
-          <w:color w:val="5B6573"/>
-          <w:sz w:val="19"/>
-        </w:rPr>
-        <w:t>Dokumentointipohjan osa 1 valmis asiakkaan tarkistettavaksi.</w:t>
+        <w:t>Näytön todiste: Projektipäiväkirjan Vko 35 -merkintä sekä linkit backlogiin, mockupiin ja hyväksyttyyn rajaukseen.</w:t>
       </w:r>
     </w:p>
     <w:p>
@@ -1076,21 +1006,7 @@
         <w:ind w:left="540"/>
       </w:pPr>
       <w:r>
-        <w:rPr>
-          <w:rFonts w:ascii="Calibri" w:hAnsi="Calibri" w:eastAsia="Calibri"/>
-          <w:b/>
-          <w:color w:val="5B6573"/>
-          <w:sz w:val="19"/>
-        </w:rPr>
-        <w:t xml:space="preserve">Näytön todiste: </w:t>
-      </w:r>
-      <w:r>
-        <w:rPr>
-          <w:rFonts w:ascii="Calibri" w:hAnsi="Calibri" w:eastAsia="Calibri"/>
-          <w:color w:val="5B6573"/>
-          <w:sz w:val="19"/>
-        </w:rPr>
-        <w:t>GitHub Issues-, Trello- tai muu näkymä sekä linkki osassa 3.</w:t>
+        <w:t>Näytön todiste: GitHub Issues -näkymä sekä linkit projektipäiväkirjan Vko 35 -merkinnässä.</w:t>
       </w:r>
     </w:p>
     <w:p>
@@ -1126,21 +1042,7 @@
         <w:ind w:left="540"/>
       </w:pPr>
       <w:r>
-        <w:rPr>
-          <w:rFonts w:ascii="Calibri" w:hAnsi="Calibri" w:eastAsia="Calibri"/>
-          <w:b/>
-          <w:color w:val="5B6573"/>
-          <w:sz w:val="19"/>
-        </w:rPr>
-        <w:t xml:space="preserve">Näytön todiste: </w:t>
-      </w:r>
-      <w:r>
-        <w:rPr>
-          <w:rFonts w:ascii="Calibri" w:hAnsi="Calibri" w:eastAsia="Calibri"/>
-          <w:color w:val="5B6573"/>
-          <w:sz w:val="19"/>
-        </w:rPr>
-        <w:t>Vähintään yksi päivätty mockup-kuva osassa 4.</w:t>
+        <w:t>Näytön todiste: Päivätty mockup polussa project-docs/evidence/week-35/mockup.png.</w:t>
       </w:r>
     </w:p>
     <w:p>
@@ -1176,21 +1078,7 @@
         <w:ind w:left="540"/>
       </w:pPr>
       <w:r>
-        <w:rPr>
-          <w:rFonts w:ascii="Calibri" w:hAnsi="Calibri" w:eastAsia="Calibri"/>
-          <w:b/>
-          <w:color w:val="5B6573"/>
-          <w:sz w:val="19"/>
-        </w:rPr>
-        <w:t xml:space="preserve">Näytön todiste: </w:t>
-      </w:r>
-      <w:r>
-        <w:rPr>
-          <w:rFonts w:ascii="Calibri" w:hAnsi="Calibri" w:eastAsia="Calibri"/>
-          <w:color w:val="5B6573"/>
-          <w:sz w:val="19"/>
-        </w:rPr>
-        <w:t>Lyhyt komponenttilista tai kaavio osassa 4.</w:t>
+        <w:t>Näytön todiste: Unityn vastuurakenne polussa project-docs/evidence/week-35/unity-rakenne.png.</w:t>
       </w:r>
     </w:p>
     <w:p>
@@ -1203,21 +1091,7 @@
         <w:spacing w:before="60" w:after="30" w:line="276" w:lineRule="auto"/>
       </w:pPr>
       <w:r>
-        <w:rPr>
-          <w:rFonts w:ascii="Calibri" w:hAnsi="Calibri" w:eastAsia="Calibri"/>
-          <w:b/>
-          <w:color w:val="1F4D78"/>
-          <w:sz w:val="21"/>
-        </w:rPr>
-        <w:t>Tee ensimmäinen pystyleikkaus.</w:t>
-      </w:r>
-      <w:r>
-        <w:rPr>
-          <w:rFonts w:ascii="Calibri" w:hAnsi="Calibri" w:eastAsia="Calibri"/>
-          <w:color w:val="000000"/>
-          <w:sz w:val="20"/>
-        </w:rPr>
-        <w:t xml:space="preserve"> Rakenna polku aloituksesta yhteen tilaukseen, oikeaan toimitukseen, pisteeseen ja pelin päättymiseen. Grafiikka saa olla väliaikaista.</w:t>
+        <w:t>Tee ensimmäinen päästä päähän pelattava kokonaisuus. Rakenna polku aloituksesta yhteen tilaukseen, oikeaan toimitukseen, pisteeseen ja pelin päättymiseen. Grafiikka saa olla väliaikaista.</w:t>
       </w:r>
     </w:p>
     <w:p>
@@ -1317,21 +1191,7 @@
         </w:pBdr>
       </w:pPr>
       <w:r>
-        <w:rPr>
-          <w:rFonts w:ascii="Calibri" w:hAnsi="Calibri" w:eastAsia="Calibri"/>
-          <w:b/>
-          <w:color w:val="0B2545"/>
-          <w:sz w:val="21"/>
-        </w:rPr>
-        <w:t xml:space="preserve">Yksi työjakso: </w:t>
-      </w:r>
-      <w:r>
-        <w:rPr>
-          <w:rFonts w:ascii="Calibri" w:hAnsi="Calibri" w:eastAsia="Calibri"/>
-          <w:color w:val="0B2545"/>
-          <w:sz w:val="21"/>
-        </w:rPr>
-        <w:t>valitse pieni tehtävä, suunnittele, toteuta, testaa, tallenna Gitillä ja kirjaa mitä opit. Jos et pysty selittämään muutosta, työ ei ole vielä valmis.</w:t>
+        <w:t>Yksi työjakso: valitse pieni tehtävä, suunnittele, toteuta, testaa ja tee commit. Kirjoita sivuston projektipäiväkirjaan mitä teit, miksi ja missä todiste on. Jos et pysty selittämään muutosta, työ ei ole vielä valmis.</w:t>
       </w:r>
     </w:p>
     <w:p>
@@ -1425,7 +1285,7 @@
           <w:color w:val="000000"/>
           <w:sz w:val="21"/>
         </w:rPr>
-        <w:t>Testaa sekä tavallinen käyttö että vähintään yksi poikkeustilanne. Kirjaa bugit testauslokiin.</w:t>
+        <w:t>Testaa sekä tavallinen käyttö että vähintään yksi poikkeustilanne. Kirjaa testi ja mahdollinen bugi kyseisen viikon projektipäiväkirjaan tai linkitettyyn testausmatriisiin.</w:t>
       </w:r>
     </w:p>
     <w:p>
@@ -1442,7 +1302,7 @@
           <w:color w:val="000000"/>
           <w:sz w:val="21"/>
         </w:rPr>
-        <w:t>Tee selkeä commit ja push. Päivitä tehtävän tila, dokumentointi ja mahdollinen tekoälyn käyttöloki.</w:t>
+        <w:t>Tee selkeä commit ja push. Päivitä tehtävän tila, sivuston projektipäiväkirja ja mahdollinen tekoälyn käyttöloki.</w:t>
       </w:r>
     </w:p>
     <w:p>
@@ -1560,7 +1420,7 @@
           <w:color w:val="000000"/>
           <w:sz w:val="21"/>
         </w:rPr>
-        <w:t>Jos teet pelin yksin, opettaja, asiakas ja nimetty vertaisopiskelija muodostavat kehitystiimin ympärillesi. Sovi tehtävistä ohjaajan kanssa, vertaile vähintään kerran kahta ratkaisuvaihtoehtoa toisen henkilön kanssa ja pyydä koodin tai toimivan version katselmointi. Kirjaa osallistujat, päätökset ja oma roolisi.</w:t>
+        <w:t>Jos teet pelin yksin, opettaja, asiakas ja nimetty vertaisopiskelija muodostavat kehitystiimin ympärillesi. Sovi tehtävistä ohjaajan kanssa, vertaile vähintään kerran kahta ratkaisuvaihtoehtoa toisen henkilön kanssa ja pyydä koodin tai toimivan version katselmointi. Kirjaa osallistujien roolit, päätökset ja oma roolisi kyseisen viikon projektipäiväkirjaan.</w:t>
       </w:r>
     </w:p>
     <w:p>
@@ -1794,21 +1654,7 @@
         <w:spacing w:after="80" w:line="276" w:lineRule="auto"/>
       </w:pPr>
       <w:r>
-        <w:rPr>
-          <w:rFonts w:ascii="Calibri" w:hAnsi="Calibri" w:eastAsia="Calibri"/>
-          <w:b/>
-          <w:color w:val="000000"/>
-          <w:sz w:val="21"/>
-        </w:rPr>
-        <w:t>Kirjaa:</w:t>
-      </w:r>
-      <w:r>
-        <w:rPr>
-          <w:rFonts w:ascii="Calibri" w:hAnsi="Calibri" w:eastAsia="Calibri"/>
-          <w:color w:val="000000"/>
-          <w:sz w:val="21"/>
-        </w:rPr>
-        <w:t xml:space="preserve"> merkitse merkittävä tekoälyn käyttö lokiin sekä kerro, mitä muutit, hylkäsit tai opit.</w:t>
+        <w:t>Kirjaa: merkitse merkittävä tekoälyn käyttö sivuston AI-lokiin sekä kerro, mitä muutit, hylkäsit tai opit. AI-loki tulee mukaan projektipäiväkirjan lataukseen.</w:t>
       </w:r>
     </w:p>
     <w:p>
@@ -2032,7 +1878,7 @@
         <w:spacing w:before="0" w:after="120" w:line="300" w:lineRule="auto"/>
       </w:pPr>
       <w:r>
-        <w:t>Täytä yksi rivi aina, kun tekoäly vaikutti projektiin jäävään työhön. Lisää todisteviite ja varmista, ettet syöttänyt henkilötietoja, salaisuuksia tai luottamuksellista aineistoa.</w:t>
+        <w:t>Täytä yksi rivi aina, kun tekoäly vaikutti projektiin jäävään työhön. Käytä ensisijaisesti sivuston AI-lokia; tämä taulukko on paperinen varavaihtoehto. Lisää todisteviite ja varmista, ettet syöttänyt henkilötietoja, salaisuuksia tai luottamuksellista aineistoa.</w:t>
       </w:r>
     </w:p>
     <w:tbl>
@@ -3739,7 +3585,7 @@
                 <w:rFonts w:ascii="Calibri" w:hAnsi="Calibri" w:eastAsia="Calibri"/>
                 <w:sz w:val="18"/>
               </w:rPr>
-              <w:t>Perusta repository, README, .gitignore ja docs-kansio.</w:t>
+              <w:t>Perusta repository, README, .gitignore ja project-docs-kansio.</w:t>
             </w:r>
           </w:p>
         </w:tc>
@@ -3914,7 +3760,7 @@
               <w:spacing w:after="40" w:line="252" w:lineRule="auto"/>
             </w:pPr>
             <w:r>
-              <w:t>Täytä dokumentointipohjan osat 1-4 ensimmäiseen versioon.</w:t>
+              <w:t>Kirjoita sivuston Vko 35 -projektipäiväkirjaan tavoite, käyttäjä, oma rooli, rajaus ja toteutustapa.</w:t>
             </w:r>
           </w:p>
           <w:p>
@@ -4027,7 +3873,6 @@
       </w:pPr>
       <w:r>
         <w:rPr>
-          <w:rFonts w:ascii="Calibri" w:hAnsi="Calibri" w:eastAsia="Calibri"/>
           <w:b/>
           <w:color w:val="1F4D78"/>
           <w:sz w:val="24"/>
@@ -4036,12 +3881,11 @@
       </w:r>
       <w:r>
         <w:rPr>
-          <w:rFonts w:ascii="Calibri" w:hAnsi="Calibri" w:eastAsia="Calibri"/>
           <w:b/>
           <w:color w:val="000000"/>
           <w:sz w:val="22"/>
         </w:rPr>
-        <w:t xml:space="preserve">  Ensimmäinen pystyleikkaus</w:t>
+        <w:t xml:space="preserve">  Ensimmäinen pelattava kokonaisuus</w:t>
       </w:r>
     </w:p>
     <w:tbl>
@@ -4352,7 +4196,7 @@
               <w:spacing w:after="40" w:line="252" w:lineRule="auto"/>
             </w:pPr>
             <w:r>
-              <w:t>Pidä OrderManagerin C#-logiikka erillään UIControllerista ja dokumentoi vastuut.</w:t>
+              <w:t>Pidä OrderManagerin C#-logiikka erillään UIControllerista ja kirjaa vastuut projektipäiväkirjan Vko 37 -merkintään.</w:t>
             </w:r>
           </w:p>
         </w:tc>
@@ -4968,7 +4812,7 @@
               <w:spacing w:after="40" w:line="252" w:lineRule="auto"/>
             </w:pPr>
             <w:r>
-              <w:t>Perustele dokumentointipohjan osassa 4, miksi top 5 tallennetaan JSON-merkkijonona PlayerPrefsiin ja mitkä ovat ratkaisun rajat.</w:t>
+              <w:t>Perustele sivuston Vko 40 -projektipäiväkirjassa, miksi top 5 tallennetaan JSON-merkkijonona PlayerPrefsiin ja mitkä ovat ratkaisun rajat.</w:t>
             </w:r>
           </w:p>
           <w:p>
@@ -6609,7 +6453,6 @@
       </w:pPr>
       <w:r>
         <w:rPr>
-          <w:rFonts w:ascii="Calibri" w:hAnsi="Calibri" w:eastAsia="Calibri"/>
           <w:b/>
           <w:color w:val="1F4D78"/>
           <w:sz w:val="24"/>
@@ -6618,12 +6461,11 @@
       </w:r>
       <w:r>
         <w:rPr>
-          <w:rFonts w:ascii="Calibri" w:hAnsi="Calibri" w:eastAsia="Calibri"/>
           <w:b/>
           <w:color w:val="000000"/>
           <w:sz w:val="22"/>
         </w:rPr>
-        <w:t xml:space="preserve">  Dokumentointi, itsearviointi ja luovutus</w:t>
+        <w:t xml:space="preserve">  Näyttö, itsearviointi ja luovutus</w:t>
       </w:r>
     </w:p>
     <w:tbl>
@@ -6704,7 +6546,7 @@
                 <w:rFonts w:ascii="Calibri" w:hAnsi="Calibri" w:eastAsia="Calibri"/>
                 <w:sz w:val="18"/>
               </w:rPr>
-              <w:t>Täytä dokumentointipohjan osat 7-8 ja tarkista kaikki aiemmat osat.</w:t>
+              <w:t>Tarkista kaikkien viikkojen projektipäiväkirja ja vie valmis tiedosto project-docs-kansioon.</w:t>
             </w:r>
           </w:p>
           <w:p>
@@ -6811,7 +6653,7 @@
                 <w:color w:val="000000"/>
                 <w:sz w:val="18"/>
               </w:rPr>
-              <w:t>Peli, repository, valmis työpaketti, näyttömatriisi, AI-loki ja esitysdemo.</w:t>
+              <w:t>Peli, repository, project-docs/projektipaivakirja.md, näyttömatriisi, AI-loki ja esitysdemo.</w:t>
             </w:r>
           </w:p>
         </w:tc>
@@ -7428,7 +7270,7 @@
                 <w:color w:val="000000"/>
                 <w:sz w:val="17"/>
               </w:rPr>
-              <w:t>Julkaistu peli, repository, dokumentit, todisteet ja itsearviointi</w:t>
+              <w:t>Julkaistu peli, repository, projektipäiväkirja, todisteet ja itsearviointi</w:t>
             </w:r>
           </w:p>
         </w:tc>
@@ -7684,7 +7526,7 @@
           <w:color w:val="5B6573"/>
           <w:sz w:val="19"/>
         </w:rPr>
-        <w:t>Täytä viimeinen sarake linkillä, tiedostonimellä, commitilla, kuvalla tai dokumentointipohjan kohdan numerolla. Pelkkä valmis peli ei todista työprosessia.</w:t>
+        <w:t>Täytä viimeinen sarake täsmällisellä linkillä, tiedostopolulla, commitilla, testitunnisteella tai projektipäiväkirjan viikolla. Pelkkä valmis peli ei todista työprosessia.</w:t>
       </w:r>
     </w:p>
     <w:tbl>
@@ -9063,7 +8905,7 @@
                 <w:color w:val="000000"/>
                 <w:sz w:val="17"/>
               </w:rPr>
-              <w:t>Itsearviointi, osa 8</w:t>
+              <w:t>Itsearviointi, projektipäiväkirja Vko 49</w:t>
             </w:r>
           </w:p>
         </w:tc>
@@ -10862,7 +10704,7 @@
         <w:keepNext/>
       </w:pPr>
       <w:r>
-        <w:t>9. Dokumentointipohjat täytetään työn aikana</w:t>
+        <w:t>9. Projektipäiväkirja täytetään työn aikana</w:t>
       </w:r>
     </w:p>
     <w:tbl>
@@ -10915,7 +10757,7 @@
                 <w:color w:val="FFFFFF"/>
                 <w:sz w:val="18"/>
               </w:rPr>
-              <w:t>Dokumentointipohjan osa</w:t>
+              <w:t>Projektipäiväkirjan viikko</w:t>
             </w:r>
           </w:p>
         </w:tc>
@@ -11004,7 +10846,7 @@
                 <w:color w:val="000000"/>
                 <w:sz w:val="17"/>
               </w:rPr>
-              <w:t>1. Näyttöprojektin suunnitelma</w:t>
+              <w:t>Vko 35: Näyttöprojektin suunnitelma</w:t>
             </w:r>
           </w:p>
         </w:tc>
@@ -11091,7 +10933,7 @@
                 <w:color w:val="000000"/>
                 <w:sz w:val="17"/>
               </w:rPr>
-              <w:t>2. Asiakastarve ja katselmoinnit</w:t>
+              <w:t>Vko 34, 41 ja 47: Asiakastarve ja katselmoinnit</w:t>
             </w:r>
           </w:p>
         </w:tc>
@@ -11180,7 +11022,7 @@
                 <w:color w:val="000000"/>
                 <w:sz w:val="17"/>
               </w:rPr>
-              <w:t>3. Tehtävälista ja työn suunnittelu</w:t>
+              <w:t>Kaikki viikot: Tehtävälista ja työn suunnittelu</w:t>
             </w:r>
           </w:p>
         </w:tc>
@@ -11267,7 +11109,7 @@
                 <w:color w:val="000000"/>
                 <w:sz w:val="17"/>
               </w:rPr>
-              <w:t>4. Tekninen ja käyttöliittymäsuunnitelma</w:t>
+              <w:t>Vko 35, 37 ja 40: Tekninen ja käyttöliittymäsuunnitelma</w:t>
             </w:r>
           </w:p>
         </w:tc>
@@ -11349,7 +11191,7 @@
                 <w:color w:val="000000"/>
                 <w:sz w:val="17"/>
               </w:rPr>
-              <w:t>5. Versionhallinta ja yhteistyö</w:t>
+              <w:t>Vko 34, 43 ja 46: Versionhallinta ja yhteistyö</w:t>
             </w:r>
           </w:p>
         </w:tc>
@@ -11436,7 +11278,7 @@
                 <w:color w:val="000000"/>
                 <w:sz w:val="17"/>
               </w:rPr>
-              <w:t>6. Testaus- ja virheenkorjausloki</w:t>
+              <w:t>Vko 36, 38 ja 45: Testaus ja virheenkorjaus</w:t>
             </w:r>
           </w:p>
         </w:tc>
@@ -11525,7 +11367,7 @@
                 <w:color w:val="000000"/>
                 <w:sz w:val="17"/>
               </w:rPr>
-              <w:t>7. Julkaisu ja luovutus</w:t>
+              <w:t>Vko 48: Julkaisu ja luovutus</w:t>
             </w:r>
           </w:p>
         </w:tc>
@@ -11612,7 +11454,7 @@
                 <w:color w:val="000000"/>
                 <w:sz w:val="17"/>
               </w:rPr>
-              <w:t>8. Itsearviointi ja näytön yhteenveto</w:t>
+              <w:t>Vko 49: Itsearviointi ja näytön yhteenveto</w:t>
             </w:r>
           </w:p>
         </w:tc>
@@ -11940,7 +11782,7 @@
                 <w:color w:val="000000"/>
                 <w:sz w:val="18"/>
               </w:rPr>
-              <w:t>Dokumentit ja todisteet</w:t>
+              <w:t>Projektipäiväkirja ja todisteet</w:t>
             </w:r>
           </w:p>
         </w:tc>
@@ -11969,7 +11811,7 @@
                 <w:color w:val="000000"/>
                 <w:sz w:val="18"/>
               </w:rPr>
-              <w:t>Täytä puuttuvat kohdat, testiloki, katselmointiloki, AI-loki ja linkit.</w:t>
+              <w:t>Tarkista puuttuvat viikkokirjaukset, testit, katselmoinnit, AI-loki ja täsmälliset linkit.</w:t>
             </w:r>
           </w:p>
         </w:tc>
@@ -12232,7 +12074,7 @@
                 <w:color w:val="000000"/>
                 <w:sz w:val="18"/>
               </w:rPr>
-              <w:t>Palauta peli, repository, dokumentit ja pidä sovittu näyttö. Projektin pitää olla valmis.</w:t>
+              <w:t>Palauta peli, repository, projektipäiväkirja ja todisteet sekä pidä sovittu näyttö. Projektin pitää olla valmis.</w:t>
             </w:r>
           </w:p>
         </w:tc>
@@ -12295,7 +12137,7 @@
           <w:color w:val="000000"/>
           <w:sz w:val="20"/>
         </w:rPr>
-        <w:t>Täytetty Näytön dokumentointipohjat -työpaketti</w:t>
+        <w:t>Repositoryyn viety project-docs/projektipaivakirja.md</w:t>
       </w:r>
     </w:p>
     <w:p>

</xml_diff>